<commit_message>
vyotiq: instance worktree checkpoint
</commit_message>
<xml_diff>
--- a/resources/marketplace/packages/persona-builder/SKILL.md.docx
+++ b/resources/marketplace/packages/persona-builder/SKILL.md.docx
@@ -13,6 +13,19 @@
       </w:pPr>
       <w:r>
         <w:t xml:space="preserve">Persona builder</w:t>
+      </w:r>
+    </w:p>
+    <w:p>
+      <w:pPr>
+        <w:pStyle w:val="Heading2"/>
+      </w:pPr>
+      <w:r>
+        <w:t xml:space="preserve">Instructions</w:t>
+      </w:r>
+    </w:p>
+    <w:p>
+      <w:r>
+        <w:t xml:space="preserve">Draft agentPersona — who the agent is — and agentTone — how the agent talks — for Agent V, each within its hard character limit. Count the characters of every draft yourself, show both texts in full with their counts, and ask via ask_question before anything touches Settings. The agent has no settings-write tool: if the user applies the persona, hand over the exact paste-ready text for Settings → Agent → Persona and Tone fields. Over-limit text fails to save.</w:t>
       </w:r>
     </w:p>
     <w:p>

</xml_diff>